<commit_message>
2025 08 17 Chapter 1 Working Sessuib
</commit_message>
<xml_diff>
--- a/Lessons_and_Logs/Neural_Networks/Chapter_1/Notes/Chapter_1.docx
+++ b/Lessons_and_Logs/Neural_Networks/Chapter_1/Notes/Chapter_1.docx
@@ -179,9 +179,27 @@
         <w:rPr>
           <w:b/>
           <w:bCs/>
-          <w:u w:val="single"/>
-        </w:rPr>
-        <w:t>(py27_env) PS C:\Users\Steve\OneDrive\Working_Files\Code\Repositories\neural-networks-and-deep-learning\src&gt; python</w:t>
+          <w:highlight w:val="yellow"/>
+          <w:u w:val="single"/>
+        </w:rPr>
+        <w:t>(py27_env) PS C:\Users\Steve\OneDrive\Working_Files\Code\Repositories\neural-networks-and-deep-learning\src</w:t>
+      </w:r>
+      <w:r>
+        <w:rPr>
+          <w:b/>
+          <w:bCs/>
+          <w:u w:val="single"/>
+        </w:rPr>
+        <w:t xml:space="preserve">&gt; </w:t>
+      </w:r>
+      <w:r>
+        <w:rPr>
+          <w:b/>
+          <w:bCs/>
+          <w:color w:val="00B050"/>
+          <w:u w:val="single"/>
+        </w:rPr>
+        <w:t>python</w:t>
       </w:r>
     </w:p>
     <w:p>
@@ -250,13 +268,23 @@
           <w:bCs/>
           <w:u w:val="single"/>
         </w:rPr>
-        <w:t xml:space="preserve">&gt;&gt;&gt; import </w:t>
-      </w:r>
-      <w:proofErr w:type="spellStart"/>
-      <w:r>
-        <w:rPr>
-          <w:b/>
-          <w:bCs/>
+        <w:t xml:space="preserve">&gt;&gt;&gt; </w:t>
+      </w:r>
+      <w:r>
+        <w:rPr>
+          <w:b/>
+          <w:bCs/>
+          <w:color w:val="00B050"/>
+          <w:u w:val="single"/>
+        </w:rPr>
+        <w:t xml:space="preserve">import </w:t>
+      </w:r>
+      <w:proofErr w:type="spellStart"/>
+      <w:r>
+        <w:rPr>
+          <w:b/>
+          <w:bCs/>
+          <w:color w:val="00B050"/>
           <w:u w:val="single"/>
         </w:rPr>
         <w:t>mnist_loader</w:t>
@@ -284,6 +312,7 @@
         <w:rPr>
           <w:b/>
           <w:bCs/>
+          <w:color w:val="00B050"/>
           <w:u w:val="single"/>
         </w:rPr>
         <w:t>training_data</w:t>
@@ -293,6 +322,7 @@
         <w:rPr>
           <w:b/>
           <w:bCs/>
+          <w:color w:val="00B050"/>
           <w:u w:val="single"/>
         </w:rPr>
         <w:t xml:space="preserve">, </w:t>
@@ -302,6 +332,7 @@
         <w:rPr>
           <w:b/>
           <w:bCs/>
+          <w:color w:val="00B050"/>
           <w:u w:val="single"/>
         </w:rPr>
         <w:t>validation_data</w:t>
@@ -311,6 +342,7 @@
         <w:rPr>
           <w:b/>
           <w:bCs/>
+          <w:color w:val="00B050"/>
           <w:u w:val="single"/>
         </w:rPr>
         <w:t xml:space="preserve">, </w:t>
@@ -320,6 +352,7 @@
         <w:rPr>
           <w:b/>
           <w:bCs/>
+          <w:color w:val="00B050"/>
           <w:u w:val="single"/>
         </w:rPr>
         <w:t>test_data</w:t>
@@ -329,6 +362,7 @@
         <w:rPr>
           <w:b/>
           <w:bCs/>
+          <w:color w:val="00B050"/>
           <w:u w:val="single"/>
         </w:rPr>
         <w:t xml:space="preserve"> = \</w:t>
@@ -355,6 +389,7 @@
         <w:rPr>
           <w:b/>
           <w:bCs/>
+          <w:color w:val="00B050"/>
           <w:u w:val="single"/>
         </w:rPr>
         <w:t>mnist_</w:t>
@@ -364,6 +399,7 @@
         <w:rPr>
           <w:b/>
           <w:bCs/>
+          <w:color w:val="00B050"/>
           <w:u w:val="single"/>
         </w:rPr>
         <w:t>loader.load</w:t>
@@ -373,6 +409,7 @@
         <w:rPr>
           <w:b/>
           <w:bCs/>
+          <w:color w:val="00B050"/>
           <w:u w:val="single"/>
         </w:rPr>
         <w:t>_data_</w:t>
@@ -382,6 +419,7 @@
         <w:rPr>
           <w:b/>
           <w:bCs/>
+          <w:color w:val="00B050"/>
           <w:u w:val="single"/>
         </w:rPr>
         <w:t>wrapper</w:t>
@@ -391,6 +429,7 @@
         <w:rPr>
           <w:b/>
           <w:bCs/>
+          <w:color w:val="00B050"/>
           <w:u w:val="single"/>
         </w:rPr>
         <w:t>(</w:t>
@@ -400,6 +439,7 @@
         <w:rPr>
           <w:b/>
           <w:bCs/>
+          <w:color w:val="00B050"/>
           <w:u w:val="single"/>
         </w:rPr>
         <w:t>)</w:t>
@@ -410,40 +450,60 @@
         <w:rPr>
           <w:b/>
           <w:bCs/>
-          <w:u w:val="single"/>
-        </w:rPr>
-      </w:pPr>
-      <w:r>
-        <w:rPr>
-          <w:b/>
-          <w:bCs/>
-          <w:u w:val="single"/>
-        </w:rPr>
-        <w:t>&gt;&gt;&gt; import network</w:t>
-      </w:r>
-    </w:p>
-    <w:p>
-      <w:pPr>
-        <w:rPr>
-          <w:b/>
-          <w:bCs/>
-          <w:u w:val="single"/>
-        </w:rPr>
-      </w:pPr>
-      <w:r>
-        <w:rPr>
-          <w:b/>
-          <w:bCs/>
-          <w:u w:val="single"/>
-        </w:rPr>
-        <w:t xml:space="preserve">&gt;&gt;&gt; net = </w:t>
-      </w:r>
-      <w:proofErr w:type="spellStart"/>
-      <w:proofErr w:type="gramStart"/>
-      <w:r>
-        <w:rPr>
-          <w:b/>
-          <w:bCs/>
+          <w:color w:val="00B050"/>
+          <w:u w:val="single"/>
+        </w:rPr>
+      </w:pPr>
+      <w:r>
+        <w:rPr>
+          <w:b/>
+          <w:bCs/>
+          <w:u w:val="single"/>
+        </w:rPr>
+        <w:t xml:space="preserve">&gt;&gt;&gt; </w:t>
+      </w:r>
+      <w:r>
+        <w:rPr>
+          <w:b/>
+          <w:bCs/>
+          <w:color w:val="00B050"/>
+          <w:u w:val="single"/>
+        </w:rPr>
+        <w:t>import network</w:t>
+      </w:r>
+    </w:p>
+    <w:p>
+      <w:pPr>
+        <w:rPr>
+          <w:b/>
+          <w:bCs/>
+          <w:u w:val="single"/>
+        </w:rPr>
+      </w:pPr>
+      <w:r>
+        <w:rPr>
+          <w:b/>
+          <w:bCs/>
+          <w:u w:val="single"/>
+        </w:rPr>
+        <w:t xml:space="preserve">&gt;&gt;&gt; </w:t>
+      </w:r>
+      <w:r>
+        <w:rPr>
+          <w:b/>
+          <w:bCs/>
+          <w:color w:val="00B050"/>
+          <w:u w:val="single"/>
+        </w:rPr>
+        <w:t xml:space="preserve">net = </w:t>
+      </w:r>
+      <w:proofErr w:type="spellStart"/>
+      <w:proofErr w:type="gramStart"/>
+      <w:r>
+        <w:rPr>
+          <w:b/>
+          <w:bCs/>
+          <w:color w:val="00B050"/>
           <w:u w:val="single"/>
         </w:rPr>
         <w:t>network.Network</w:t>
@@ -454,6 +514,7 @@
         <w:rPr>
           <w:b/>
           <w:bCs/>
+          <w:color w:val="00B050"/>
           <w:u w:val="single"/>
         </w:rPr>
         <w:t>([784, 30, 10])</w:t>
@@ -481,6 +542,7 @@
         <w:rPr>
           <w:b/>
           <w:bCs/>
+          <w:color w:val="00B050"/>
           <w:u w:val="single"/>
         </w:rPr>
         <w:t>net.SGD</w:t>
@@ -490,6 +552,7 @@
         <w:rPr>
           <w:b/>
           <w:bCs/>
+          <w:color w:val="00B050"/>
           <w:u w:val="single"/>
         </w:rPr>
         <w:t>(</w:t>
@@ -500,6 +563,7 @@
         <w:rPr>
           <w:b/>
           <w:bCs/>
+          <w:color w:val="00B050"/>
           <w:u w:val="single"/>
         </w:rPr>
         <w:t>training_data</w:t>
@@ -509,6 +573,7 @@
         <w:rPr>
           <w:b/>
           <w:bCs/>
+          <w:color w:val="00B050"/>
           <w:u w:val="single"/>
         </w:rPr>
         <w:t xml:space="preserve">, 30, 10, 3.0, </w:t>
@@ -518,6 +583,7 @@
         <w:rPr>
           <w:b/>
           <w:bCs/>
+          <w:color w:val="00B050"/>
           <w:u w:val="single"/>
         </w:rPr>
         <w:t>test_data</w:t>
@@ -527,6 +593,7 @@
         <w:rPr>
           <w:b/>
           <w:bCs/>
+          <w:color w:val="00B050"/>
           <w:u w:val="single"/>
         </w:rPr>
         <w:t>=</w:t>
@@ -536,6 +603,7 @@
         <w:rPr>
           <w:b/>
           <w:bCs/>
+          <w:color w:val="00B050"/>
           <w:u w:val="single"/>
         </w:rPr>
         <w:t>test_data</w:t>
@@ -545,6 +613,7 @@
         <w:rPr>
           <w:b/>
           <w:bCs/>
+          <w:color w:val="00B050"/>
           <w:u w:val="single"/>
         </w:rPr>
         <w:t>)</w:t>
@@ -558,508 +627,6 @@
           <w:u w:val="single"/>
         </w:rPr>
       </w:pPr>
-      <w:r>
-        <w:rPr>
-          <w:b/>
-          <w:bCs/>
-          <w:u w:val="single"/>
-        </w:rPr>
-        <w:t>Epoch 0: 9095 / 10000</w:t>
-      </w:r>
-    </w:p>
-    <w:p>
-      <w:pPr>
-        <w:rPr>
-          <w:b/>
-          <w:bCs/>
-          <w:u w:val="single"/>
-        </w:rPr>
-      </w:pPr>
-      <w:r>
-        <w:rPr>
-          <w:b/>
-          <w:bCs/>
-          <w:u w:val="single"/>
-        </w:rPr>
-        <w:t>Epoch 1: 9239 / 10000</w:t>
-      </w:r>
-    </w:p>
-    <w:p>
-      <w:pPr>
-        <w:rPr>
-          <w:b/>
-          <w:bCs/>
-          <w:u w:val="single"/>
-        </w:rPr>
-      </w:pPr>
-      <w:r>
-        <w:rPr>
-          <w:b/>
-          <w:bCs/>
-          <w:u w:val="single"/>
-        </w:rPr>
-        <w:t>Epoch 2: 9315 / 10000</w:t>
-      </w:r>
-    </w:p>
-    <w:p>
-      <w:pPr>
-        <w:rPr>
-          <w:b/>
-          <w:bCs/>
-          <w:u w:val="single"/>
-        </w:rPr>
-      </w:pPr>
-      <w:r>
-        <w:rPr>
-          <w:b/>
-          <w:bCs/>
-          <w:u w:val="single"/>
-        </w:rPr>
-        <w:t>Epoch 3: 9330 / 10000</w:t>
-      </w:r>
-    </w:p>
-    <w:p>
-      <w:pPr>
-        <w:rPr>
-          <w:b/>
-          <w:bCs/>
-          <w:u w:val="single"/>
-        </w:rPr>
-      </w:pPr>
-      <w:r>
-        <w:rPr>
-          <w:b/>
-          <w:bCs/>
-          <w:u w:val="single"/>
-        </w:rPr>
-        <w:t>Epoch 4: 9393 / 10000</w:t>
-      </w:r>
-    </w:p>
-    <w:p>
-      <w:pPr>
-        <w:rPr>
-          <w:b/>
-          <w:bCs/>
-          <w:u w:val="single"/>
-        </w:rPr>
-      </w:pPr>
-      <w:r>
-        <w:rPr>
-          <w:b/>
-          <w:bCs/>
-          <w:u w:val="single"/>
-        </w:rPr>
-        <w:t>Epoch 5: 9419 / 10000</w:t>
-      </w:r>
-    </w:p>
-    <w:p>
-      <w:pPr>
-        <w:rPr>
-          <w:b/>
-          <w:bCs/>
-          <w:u w:val="single"/>
-        </w:rPr>
-      </w:pPr>
-      <w:r>
-        <w:rPr>
-          <w:b/>
-          <w:bCs/>
-          <w:u w:val="single"/>
-        </w:rPr>
-        <w:t>Epoch 6: 9422 / 10000</w:t>
-      </w:r>
-    </w:p>
-    <w:p>
-      <w:pPr>
-        <w:rPr>
-          <w:b/>
-          <w:bCs/>
-          <w:u w:val="single"/>
-        </w:rPr>
-      </w:pPr>
-      <w:r>
-        <w:rPr>
-          <w:b/>
-          <w:bCs/>
-          <w:u w:val="single"/>
-        </w:rPr>
-        <w:lastRenderedPageBreak/>
-        <w:t>Epoch 7: 9454 / 10000</w:t>
-      </w:r>
-    </w:p>
-    <w:p>
-      <w:pPr>
-        <w:rPr>
-          <w:b/>
-          <w:bCs/>
-          <w:u w:val="single"/>
-        </w:rPr>
-      </w:pPr>
-      <w:r>
-        <w:rPr>
-          <w:b/>
-          <w:bCs/>
-          <w:u w:val="single"/>
-        </w:rPr>
-        <w:t>Epoch 8: 9457 / 10000</w:t>
-      </w:r>
-    </w:p>
-    <w:p>
-      <w:pPr>
-        <w:rPr>
-          <w:b/>
-          <w:bCs/>
-          <w:u w:val="single"/>
-        </w:rPr>
-      </w:pPr>
-      <w:r>
-        <w:rPr>
-          <w:b/>
-          <w:bCs/>
-          <w:u w:val="single"/>
-        </w:rPr>
-        <w:t>Epoch 9: 9448 / 10000</w:t>
-      </w:r>
-    </w:p>
-    <w:p>
-      <w:pPr>
-        <w:rPr>
-          <w:b/>
-          <w:bCs/>
-          <w:u w:val="single"/>
-        </w:rPr>
-      </w:pPr>
-      <w:r>
-        <w:rPr>
-          <w:b/>
-          <w:bCs/>
-          <w:u w:val="single"/>
-        </w:rPr>
-        <w:t>Epoch 10: 9458 / 10000</w:t>
-      </w:r>
-    </w:p>
-    <w:p>
-      <w:pPr>
-        <w:rPr>
-          <w:b/>
-          <w:bCs/>
-          <w:u w:val="single"/>
-        </w:rPr>
-      </w:pPr>
-      <w:r>
-        <w:rPr>
-          <w:b/>
-          <w:bCs/>
-          <w:u w:val="single"/>
-        </w:rPr>
-        <w:t>Epoch 11: 9464 / 10000</w:t>
-      </w:r>
-    </w:p>
-    <w:p>
-      <w:pPr>
-        <w:rPr>
-          <w:b/>
-          <w:bCs/>
-          <w:u w:val="single"/>
-        </w:rPr>
-      </w:pPr>
-      <w:r>
-        <w:rPr>
-          <w:b/>
-          <w:bCs/>
-          <w:u w:val="single"/>
-        </w:rPr>
-        <w:t>Epoch 12: 9490 / 10000</w:t>
-      </w:r>
-    </w:p>
-    <w:p>
-      <w:pPr>
-        <w:rPr>
-          <w:b/>
-          <w:bCs/>
-          <w:u w:val="single"/>
-        </w:rPr>
-      </w:pPr>
-      <w:r>
-        <w:rPr>
-          <w:b/>
-          <w:bCs/>
-          <w:u w:val="single"/>
-        </w:rPr>
-        <w:t>Epoch 13: 9474 / 10000</w:t>
-      </w:r>
-    </w:p>
-    <w:p>
-      <w:pPr>
-        <w:rPr>
-          <w:b/>
-          <w:bCs/>
-          <w:u w:val="single"/>
-        </w:rPr>
-      </w:pPr>
-      <w:r>
-        <w:rPr>
-          <w:b/>
-          <w:bCs/>
-          <w:u w:val="single"/>
-        </w:rPr>
-        <w:t>Epoch 14: 9494 / 10000</w:t>
-      </w:r>
-    </w:p>
-    <w:p>
-      <w:pPr>
-        <w:rPr>
-          <w:b/>
-          <w:bCs/>
-          <w:u w:val="single"/>
-        </w:rPr>
-      </w:pPr>
-      <w:r>
-        <w:rPr>
-          <w:b/>
-          <w:bCs/>
-          <w:u w:val="single"/>
-        </w:rPr>
-        <w:t>Epoch 15: 9460 / 10000</w:t>
-      </w:r>
-    </w:p>
-    <w:p>
-      <w:pPr>
-        <w:rPr>
-          <w:b/>
-          <w:bCs/>
-          <w:u w:val="single"/>
-        </w:rPr>
-      </w:pPr>
-      <w:r>
-        <w:rPr>
-          <w:b/>
-          <w:bCs/>
-          <w:u w:val="single"/>
-        </w:rPr>
-        <w:t>Epoch 16: 9474 / 10000</w:t>
-      </w:r>
-    </w:p>
-    <w:p>
-      <w:pPr>
-        <w:rPr>
-          <w:b/>
-          <w:bCs/>
-          <w:u w:val="single"/>
-        </w:rPr>
-      </w:pPr>
-      <w:r>
-        <w:rPr>
-          <w:b/>
-          <w:bCs/>
-          <w:u w:val="single"/>
-        </w:rPr>
-        <w:t>Epoch 17: 9464 / 10000</w:t>
-      </w:r>
-    </w:p>
-    <w:p>
-      <w:pPr>
-        <w:rPr>
-          <w:b/>
-          <w:bCs/>
-          <w:u w:val="single"/>
-        </w:rPr>
-      </w:pPr>
-      <w:r>
-        <w:rPr>
-          <w:b/>
-          <w:bCs/>
-          <w:u w:val="single"/>
-        </w:rPr>
-        <w:t>Epoch 18: 9501 / 10000</w:t>
-      </w:r>
-    </w:p>
-    <w:p>
-      <w:pPr>
-        <w:rPr>
-          <w:b/>
-          <w:bCs/>
-          <w:u w:val="single"/>
-        </w:rPr>
-      </w:pPr>
-      <w:r>
-        <w:rPr>
-          <w:b/>
-          <w:bCs/>
-          <w:u w:val="single"/>
-        </w:rPr>
-        <w:t>Epoch 19: 9477 / 10000</w:t>
-      </w:r>
-    </w:p>
-    <w:p>
-      <w:pPr>
-        <w:rPr>
-          <w:b/>
-          <w:bCs/>
-          <w:u w:val="single"/>
-        </w:rPr>
-      </w:pPr>
-      <w:r>
-        <w:rPr>
-          <w:b/>
-          <w:bCs/>
-          <w:u w:val="single"/>
-        </w:rPr>
-        <w:t>Epoch 20: 9465 / 10000</w:t>
-      </w:r>
-    </w:p>
-    <w:p>
-      <w:pPr>
-        <w:rPr>
-          <w:b/>
-          <w:bCs/>
-          <w:u w:val="single"/>
-        </w:rPr>
-      </w:pPr>
-      <w:r>
-        <w:rPr>
-          <w:b/>
-          <w:bCs/>
-          <w:u w:val="single"/>
-        </w:rPr>
-        <w:t>Epoch 21: 9496 / 10000</w:t>
-      </w:r>
-    </w:p>
-    <w:p>
-      <w:pPr>
-        <w:rPr>
-          <w:b/>
-          <w:bCs/>
-          <w:u w:val="single"/>
-        </w:rPr>
-      </w:pPr>
-      <w:r>
-        <w:rPr>
-          <w:b/>
-          <w:bCs/>
-          <w:u w:val="single"/>
-        </w:rPr>
-        <w:t>Epoch 22: 9501 / 10000</w:t>
-      </w:r>
-    </w:p>
-    <w:p>
-      <w:pPr>
-        <w:rPr>
-          <w:b/>
-          <w:bCs/>
-          <w:u w:val="single"/>
-        </w:rPr>
-      </w:pPr>
-      <w:r>
-        <w:rPr>
-          <w:b/>
-          <w:bCs/>
-          <w:u w:val="single"/>
-        </w:rPr>
-        <w:t>Epoch 23: 9508 / 10000</w:t>
-      </w:r>
-    </w:p>
-    <w:p>
-      <w:pPr>
-        <w:rPr>
-          <w:b/>
-          <w:bCs/>
-          <w:u w:val="single"/>
-        </w:rPr>
-      </w:pPr>
-      <w:r>
-        <w:rPr>
-          <w:b/>
-          <w:bCs/>
-          <w:u w:val="single"/>
-        </w:rPr>
-        <w:t>Epoch 24: 9517 / 10000</w:t>
-      </w:r>
-    </w:p>
-    <w:p>
-      <w:pPr>
-        <w:rPr>
-          <w:b/>
-          <w:bCs/>
-          <w:u w:val="single"/>
-        </w:rPr>
-      </w:pPr>
-      <w:r>
-        <w:rPr>
-          <w:b/>
-          <w:bCs/>
-          <w:u w:val="single"/>
-        </w:rPr>
-        <w:t>Epoch 25: 9495 / 10000</w:t>
-      </w:r>
-    </w:p>
-    <w:p>
-      <w:pPr>
-        <w:rPr>
-          <w:b/>
-          <w:bCs/>
-          <w:u w:val="single"/>
-        </w:rPr>
-      </w:pPr>
-      <w:r>
-        <w:rPr>
-          <w:b/>
-          <w:bCs/>
-          <w:u w:val="single"/>
-        </w:rPr>
-        <w:t>Epoch 26: 9504 / 10000</w:t>
-      </w:r>
-    </w:p>
-    <w:p>
-      <w:pPr>
-        <w:rPr>
-          <w:b/>
-          <w:bCs/>
-          <w:u w:val="single"/>
-        </w:rPr>
-      </w:pPr>
-      <w:r>
-        <w:rPr>
-          <w:b/>
-          <w:bCs/>
-          <w:u w:val="single"/>
-        </w:rPr>
-        <w:t>Epoch 27: 9510 / 10000</w:t>
-      </w:r>
-    </w:p>
-    <w:p>
-      <w:pPr>
-        <w:rPr>
-          <w:b/>
-          <w:bCs/>
-          <w:u w:val="single"/>
-        </w:rPr>
-      </w:pPr>
-      <w:r>
-        <w:rPr>
-          <w:b/>
-          <w:bCs/>
-          <w:u w:val="single"/>
-        </w:rPr>
-        <w:t>Epoch 28: 9480 / 10000</w:t>
-      </w:r>
-    </w:p>
-    <w:p>
-      <w:pPr>
-        <w:rPr>
-          <w:b/>
-          <w:bCs/>
-          <w:u w:val="single"/>
-        </w:rPr>
-      </w:pPr>
-      <w:r>
-        <w:rPr>
-          <w:b/>
-          <w:bCs/>
-          <w:u w:val="single"/>
-        </w:rPr>
-        <w:t>Epoch 29: 9493 / 10000</w:t>
-      </w:r>
       <w:r>
         <w:rPr>
           <w:b/>

</xml_diff>